<commit_message>
feat(visuals): Implement screen-whitening VFX overlay during Dimoo ultimate
</commit_message>
<xml_diff>
--- a/Assignment/TCG6223-Assignment-AnswerTemplate.docx
+++ b/Assignment/TCG6223-Assignment-AnswerTemplate.docx
@@ -490,12 +490,21 @@
               <w:spacing w:after="120" w:line="240" w:lineRule="auto"/>
               <w:jc w:val="both"/>
               <w:rPr>
-                <w:rFonts w:ascii="Times New Roman" w:eastAsia="JansonText-Roman" w:hAnsi="Times New Roman" w:cs="Times New Roman"/>
+                <w:rFonts w:ascii="Times New Roman" w:eastAsia="JansonText-Roman" w:hAnsi="Times New Roman" w:cs="Times New Roman" w:hint="eastAsia"/>
                 <w:sz w:val="24"/>
                 <w:szCs w:val="24"/>
                 <w:lang w:eastAsia="zh-CN"/>
               </w:rPr>
             </w:pPr>
+            <w:r>
+              <w:rPr>
+                <w:rFonts w:ascii="Times New Roman" w:eastAsia="JansonText-Roman" w:hAnsi="Times New Roman" w:cs="Times New Roman" w:hint="eastAsia"/>
+                <w:sz w:val="24"/>
+                <w:szCs w:val="24"/>
+                <w:lang w:eastAsia="zh-CN"/>
+              </w:rPr>
+              <w:t>243UT246WJ</w:t>
+            </w:r>
           </w:p>
         </w:tc>
         <w:tc>
@@ -510,12 +519,21 @@
               <w:spacing w:after="120" w:line="240" w:lineRule="auto"/>
               <w:jc w:val="both"/>
               <w:rPr>
-                <w:rFonts w:ascii="Times New Roman" w:eastAsia="JansonText-Roman" w:hAnsi="Times New Roman" w:cs="Times New Roman"/>
+                <w:rFonts w:ascii="Times New Roman" w:eastAsia="JansonText-Roman" w:hAnsi="Times New Roman" w:cs="Times New Roman" w:hint="eastAsia"/>
                 <w:sz w:val="24"/>
                 <w:szCs w:val="24"/>
                 <w:lang w:eastAsia="zh-CN"/>
               </w:rPr>
             </w:pPr>
+            <w:r>
+              <w:rPr>
+                <w:rFonts w:ascii="Times New Roman" w:eastAsia="JansonText-Roman" w:hAnsi="Times New Roman" w:cs="Times New Roman" w:hint="eastAsia"/>
+                <w:sz w:val="24"/>
+                <w:szCs w:val="24"/>
+                <w:lang w:eastAsia="zh-CN"/>
+              </w:rPr>
+              <w:t>Lim Wei Jian</w:t>
+            </w:r>
           </w:p>
         </w:tc>
       </w:tr>
@@ -532,12 +550,21 @@
               <w:spacing w:after="120" w:line="240" w:lineRule="auto"/>
               <w:jc w:val="both"/>
               <w:rPr>
-                <w:rFonts w:ascii="Times New Roman" w:eastAsia="JansonText-Roman" w:hAnsi="Times New Roman" w:cs="Times New Roman"/>
+                <w:rFonts w:ascii="Times New Roman" w:eastAsia="JansonText-Roman" w:hAnsi="Times New Roman" w:cs="Times New Roman" w:hint="eastAsia"/>
                 <w:sz w:val="24"/>
                 <w:szCs w:val="24"/>
                 <w:lang w:eastAsia="zh-CN"/>
               </w:rPr>
             </w:pPr>
+            <w:r>
+              <w:rPr>
+                <w:rFonts w:ascii="Times New Roman" w:eastAsia="JansonText-Roman" w:hAnsi="Times New Roman" w:cs="Times New Roman" w:hint="eastAsia"/>
+                <w:sz w:val="24"/>
+                <w:szCs w:val="24"/>
+                <w:lang w:eastAsia="zh-CN"/>
+              </w:rPr>
+              <w:t>243UT246WG</w:t>
+            </w:r>
           </w:p>
         </w:tc>
         <w:tc>
@@ -552,12 +579,21 @@
               <w:spacing w:after="120" w:line="240" w:lineRule="auto"/>
               <w:jc w:val="both"/>
               <w:rPr>
-                <w:rFonts w:ascii="Times New Roman" w:eastAsia="JansonText-Roman" w:hAnsi="Times New Roman" w:cs="Times New Roman"/>
+                <w:rFonts w:ascii="Times New Roman" w:eastAsia="JansonText-Roman" w:hAnsi="Times New Roman" w:cs="Times New Roman" w:hint="eastAsia"/>
                 <w:sz w:val="24"/>
                 <w:szCs w:val="24"/>
                 <w:lang w:eastAsia="zh-CN"/>
               </w:rPr>
             </w:pPr>
+            <w:r>
+              <w:rPr>
+                <w:rFonts w:ascii="Times New Roman" w:eastAsia="JansonText-Roman" w:hAnsi="Times New Roman" w:cs="Times New Roman" w:hint="eastAsia"/>
+                <w:sz w:val="24"/>
+                <w:szCs w:val="24"/>
+                <w:lang w:eastAsia="zh-CN"/>
+              </w:rPr>
+              <w:t>Bong Li Hen</w:t>
+            </w:r>
           </w:p>
         </w:tc>
       </w:tr>
@@ -574,12 +610,21 @@
               <w:spacing w:after="120" w:line="240" w:lineRule="auto"/>
               <w:jc w:val="both"/>
               <w:rPr>
-                <w:rFonts w:ascii="Times New Roman" w:eastAsia="JansonText-Roman" w:hAnsi="Times New Roman" w:cs="Times New Roman"/>
+                <w:rFonts w:ascii="Times New Roman" w:eastAsia="JansonText-Roman" w:hAnsi="Times New Roman" w:cs="Times New Roman" w:hint="eastAsia"/>
                 <w:sz w:val="24"/>
                 <w:szCs w:val="24"/>
                 <w:lang w:eastAsia="zh-CN"/>
               </w:rPr>
             </w:pPr>
+            <w:r>
+              <w:rPr>
+                <w:rFonts w:ascii="Times New Roman" w:eastAsia="JansonText-Roman" w:hAnsi="Times New Roman" w:cs="Times New Roman" w:hint="eastAsia"/>
+                <w:sz w:val="24"/>
+                <w:szCs w:val="24"/>
+                <w:lang w:eastAsia="zh-CN"/>
+              </w:rPr>
+              <w:t>243UT246WH</w:t>
+            </w:r>
           </w:p>
         </w:tc>
         <w:tc>
@@ -594,12 +639,21 @@
               <w:spacing w:after="120" w:line="240" w:lineRule="auto"/>
               <w:jc w:val="both"/>
               <w:rPr>
-                <w:rFonts w:ascii="Times New Roman" w:eastAsia="JansonText-Roman" w:hAnsi="Times New Roman" w:cs="Times New Roman"/>
+                <w:rFonts w:ascii="Times New Roman" w:eastAsia="JansonText-Roman" w:hAnsi="Times New Roman" w:cs="Times New Roman" w:hint="eastAsia"/>
                 <w:sz w:val="24"/>
                 <w:szCs w:val="24"/>
                 <w:lang w:eastAsia="zh-CN"/>
               </w:rPr>
             </w:pPr>
+            <w:r>
+              <w:rPr>
+                <w:rFonts w:ascii="Times New Roman" w:eastAsia="JansonText-Roman" w:hAnsi="Times New Roman" w:cs="Times New Roman" w:hint="eastAsia"/>
+                <w:sz w:val="24"/>
+                <w:szCs w:val="24"/>
+                <w:lang w:eastAsia="zh-CN"/>
+              </w:rPr>
+              <w:t>Tan Wen Jian</w:t>
+            </w:r>
           </w:p>
         </w:tc>
       </w:tr>
@@ -663,6 +717,32 @@
     </w:p>
     <w:p>
       <w:pPr>
+        <w:spacing w:after="160" w:line="259" w:lineRule="auto"/>
+        <w:rPr>
+          <w:rFonts w:ascii="Times New Roman" w:eastAsia="JansonText-Roman" w:hAnsi="Times New Roman" w:cs="Times New Roman"/>
+          <w:b/>
+          <w:bCs/>
+          <w:sz w:val="24"/>
+          <w:szCs w:val="24"/>
+          <w:u w:val="single"/>
+          <w:lang w:eastAsia="zh-CN"/>
+        </w:rPr>
+      </w:pPr>
+      <w:r>
+        <w:rPr>
+          <w:rFonts w:ascii="Times New Roman" w:eastAsia="JansonText-Roman" w:hAnsi="Times New Roman" w:cs="Times New Roman"/>
+          <w:b/>
+          <w:bCs/>
+          <w:sz w:val="24"/>
+          <w:szCs w:val="24"/>
+          <w:u w:val="single"/>
+          <w:lang w:eastAsia="zh-CN"/>
+        </w:rPr>
+        <w:br w:type="page"/>
+      </w:r>
+    </w:p>
+    <w:p>
+      <w:pPr>
         <w:autoSpaceDE w:val="0"/>
         <w:autoSpaceDN w:val="0"/>
         <w:adjustRightInd w:val="0"/>
@@ -688,6 +768,7 @@
           <w:u w:val="single"/>
           <w:lang w:eastAsia="zh-CN"/>
         </w:rPr>
+        <w:lastRenderedPageBreak/>
         <w:t>ANSWER</w:t>
       </w:r>
       <w:r>
@@ -746,14 +827,184 @@
     <w:p>
       <w:pPr>
         <w:spacing w:after="0"/>
-        <w:jc w:val="both"/>
+        <w:jc w:val="center"/>
+        <w:rPr>
+          <w:rFonts w:eastAsiaTheme="minorEastAsia" w:cstheme="minorHAnsi"/>
+          <w:spacing w:val="5"/>
+          <w:sz w:val="24"/>
+          <w:szCs w:val="24"/>
+          <w:lang w:eastAsia="zh-CN"/>
+        </w:rPr>
+      </w:pPr>
+      <w:r>
         <w:rPr>
           <w:rFonts w:cstheme="minorHAnsi"/>
           <w:spacing w:val="5"/>
           <w:sz w:val="24"/>
           <w:szCs w:val="24"/>
         </w:rPr>
-      </w:pPr>
+        <w:drawing>
+          <wp:inline distT="0" distB="0" distL="0" distR="0" wp14:anchorId="23D79FF6" wp14:editId="5A5F4B95">
+            <wp:extent cx="3571336" cy="4639577"/>
+            <wp:effectExtent l="0" t="0" r="0" b="8890"/>
+            <wp:docPr id="1507817694" name="Picture 1"/>
+            <wp:cNvGraphicFramePr>
+              <a:graphicFrameLocks xmlns:a="http://schemas.openxmlformats.org/drawingml/2006/main" noChangeAspect="1"/>
+            </wp:cNvGraphicFramePr>
+            <a:graphic xmlns:a="http://schemas.openxmlformats.org/drawingml/2006/main">
+              <a:graphicData uri="http://schemas.openxmlformats.org/drawingml/2006/picture">
+                <pic:pic xmlns:pic="http://schemas.openxmlformats.org/drawingml/2006/picture">
+                  <pic:nvPicPr>
+                    <pic:cNvPr id="1507817694" name=""/>
+                    <pic:cNvPicPr/>
+                  </pic:nvPicPr>
+                  <pic:blipFill>
+                    <a:blip r:embed="rId8"/>
+                    <a:stretch>
+                      <a:fillRect/>
+                    </a:stretch>
+                  </pic:blipFill>
+                  <pic:spPr>
+                    <a:xfrm>
+                      <a:off x="0" y="0"/>
+                      <a:ext cx="3580329" cy="4651260"/>
+                    </a:xfrm>
+                    <a:prstGeom prst="rect">
+                      <a:avLst/>
+                    </a:prstGeom>
+                  </pic:spPr>
+                </pic:pic>
+              </a:graphicData>
+            </a:graphic>
+          </wp:inline>
+        </w:drawing>
+      </w:r>
+    </w:p>
+    <w:p>
+      <w:pPr>
+        <w:spacing w:after="0"/>
+        <w:jc w:val="both"/>
+        <w:rPr>
+          <w:rFonts w:eastAsiaTheme="minorEastAsia" w:cstheme="minorHAnsi"/>
+          <w:spacing w:val="5"/>
+          <w:sz w:val="24"/>
+          <w:szCs w:val="24"/>
+          <w:lang w:eastAsia="zh-CN"/>
+        </w:rPr>
+      </w:pPr>
+      <w:r>
+        <w:rPr>
+          <w:rFonts w:eastAsiaTheme="minorEastAsia" w:cstheme="minorHAnsi"/>
+          <w:spacing w:val="5"/>
+          <w:sz w:val="24"/>
+          <w:szCs w:val="24"/>
+          <w:lang w:eastAsia="zh-CN"/>
+        </w:rPr>
+        <w:t xml:space="preserve">The objective is to render a 2D flower consisting of a green core disk and 10 red petals at the origin. The green core is drawn as a GLU quadric disk with a radius of 2.0. The 10 petals are rendered as thick red trapezoids rotated at 36-degree intervals, offset by 18 degrees so that the positive Y-axis aligns with the top petal's </w:t>
+      </w:r>
+      <w:proofErr w:type="spellStart"/>
+      <w:r>
+        <w:rPr>
+          <w:rFonts w:eastAsiaTheme="minorEastAsia" w:cstheme="minorHAnsi"/>
+          <w:spacing w:val="5"/>
+          <w:sz w:val="24"/>
+          <w:szCs w:val="24"/>
+          <w:lang w:eastAsia="zh-CN"/>
+        </w:rPr>
+        <w:t>center</w:t>
+      </w:r>
+      <w:proofErr w:type="spellEnd"/>
+      <w:r>
+        <w:rPr>
+          <w:rFonts w:eastAsiaTheme="minorEastAsia" w:cstheme="minorHAnsi"/>
+          <w:spacing w:val="5"/>
+          <w:sz w:val="24"/>
+          <w:szCs w:val="24"/>
+          <w:lang w:eastAsia="zh-CN"/>
+        </w:rPr>
+        <w:t xml:space="preserve"> and the positive X-axis aligns with a gap. The petals are designed with Cartesian widths of y=±1.2 at the base and y=±0.8 at the tip to make them look thick and slightly overlapping.</w:t>
+      </w:r>
+    </w:p>
+    <w:p>
+      <w:pPr>
+        <w:spacing w:after="0"/>
+        <w:jc w:val="both"/>
+        <w:rPr>
+          <w:rFonts w:eastAsiaTheme="minorEastAsia" w:cstheme="minorHAnsi"/>
+          <w:spacing w:val="5"/>
+          <w:sz w:val="24"/>
+          <w:szCs w:val="24"/>
+          <w:lang w:val="en-US" w:eastAsia="zh-CN"/>
+        </w:rPr>
+      </w:pPr>
+      <w:r>
+        <w:rPr>
+          <w:rFonts w:eastAsiaTheme="minorEastAsia" w:cstheme="minorHAnsi"/>
+          <w:spacing w:val="5"/>
+          <w:sz w:val="24"/>
+          <w:szCs w:val="24"/>
+          <w:lang w:eastAsia="zh-CN"/>
+        </w:rPr>
+        <w:t xml:space="preserve">The 10 petals are distributed evenly around the 360-degree circle at 36-degree intervals. To align the top petal with the Y-axis and place a gap on the X-axis, the rotation </w:t>
+      </w:r>
+      <w:proofErr w:type="spellStart"/>
+      <w:r>
+        <w:rPr>
+          <w:rFonts w:eastAsiaTheme="minorEastAsia" w:cstheme="minorHAnsi"/>
+          <w:spacing w:val="5"/>
+          <w:sz w:val="24"/>
+          <w:szCs w:val="24"/>
+          <w:lang w:eastAsia="zh-CN"/>
+        </w:rPr>
+        <w:t>center</w:t>
+      </w:r>
+      <w:proofErr w:type="spellEnd"/>
+      <w:r>
+        <w:rPr>
+          <w:rFonts w:eastAsiaTheme="minorEastAsia" w:cstheme="minorHAnsi"/>
+          <w:spacing w:val="5"/>
+          <w:sz w:val="24"/>
+          <w:szCs w:val="24"/>
+          <w:lang w:eastAsia="zh-CN"/>
+        </w:rPr>
+        <w:t xml:space="preserve"> for each petal is calculated using the formula  for . Instead of using polar coordinates, the trapezoidal shape of each petal is defined using Cartesian coordinates in the local frame. The base vertices are placed at  to create a wide contact area that overlaps adjacent petals, while the tip vertices are placed at  to form a narrower flat top with tapered sides.</w:t>
+      </w:r>
+    </w:p>
+    <w:p>
+      <w:pPr>
+        <w:spacing w:after="0"/>
+        <w:jc w:val="both"/>
+        <w:rPr>
+          <w:rFonts w:eastAsiaTheme="minorEastAsia" w:cstheme="minorHAnsi" w:hint="eastAsia"/>
+          <w:spacing w:val="5"/>
+          <w:sz w:val="24"/>
+          <w:szCs w:val="24"/>
+          <w:lang w:val="en-US" w:eastAsia="zh-CN"/>
+        </w:rPr>
+      </w:pPr>
+    </w:p>
+    <w:p>
+      <w:pPr>
+        <w:spacing w:after="160" w:line="259" w:lineRule="auto"/>
+        <w:rPr>
+          <w:rFonts w:cstheme="minorHAnsi"/>
+          <w:spacing w:val="5"/>
+          <w:sz w:val="24"/>
+          <w:szCs w:val="24"/>
+          <w:shd w:val="clear" w:color="auto" w:fill="FFFFFF"/>
+        </w:rPr>
+      </w:pPr>
+      <w:r>
+        <w:rPr>
+          <w:rFonts w:cstheme="minorHAnsi"/>
+          <w:spacing w:val="5"/>
+          <w:sz w:val="24"/>
+          <w:szCs w:val="24"/>
+          <w:shd w:val="clear" w:color="auto" w:fill="FFFFFF"/>
+        </w:rPr>
+        <w:lastRenderedPageBreak/>
+        <w:br w:type="page"/>
+      </w:r>
     </w:p>
     <w:p>
       <w:pPr>
@@ -780,6 +1031,7 @@
           <w:szCs w:val="24"/>
           <w:shd w:val="clear" w:color="auto" w:fill="FFFFFF"/>
         </w:rPr>
+        <w:lastRenderedPageBreak/>
         <w:t xml:space="preserve">screenshots of output simulation. </w:t>
       </w:r>
     </w:p>
@@ -788,6 +1040,63 @@
         <w:spacing w:after="0"/>
         <w:jc w:val="both"/>
         <w:rPr>
+          <w:rFonts w:eastAsiaTheme="minorEastAsia" w:cstheme="minorHAnsi" w:hint="eastAsia"/>
+          <w:spacing w:val="5"/>
+          <w:sz w:val="24"/>
+          <w:szCs w:val="24"/>
+          <w:lang w:eastAsia="zh-CN"/>
+        </w:rPr>
+      </w:pPr>
+      <w:r>
+        <w:rPr>
+          <w:rFonts w:eastAsiaTheme="minorEastAsia" w:cstheme="minorHAnsi"/>
+          <w:spacing w:val="5"/>
+          <w:sz w:val="24"/>
+          <w:szCs w:val="24"/>
+          <w:lang w:eastAsia="zh-CN"/>
+        </w:rPr>
+        <w:drawing>
+          <wp:inline distT="0" distB="0" distL="0" distR="0" wp14:anchorId="45500AA6" wp14:editId="309AE94B">
+            <wp:extent cx="5943600" cy="3183890"/>
+            <wp:effectExtent l="0" t="0" r="0" b="0"/>
+            <wp:docPr id="683006359" name="Picture 1"/>
+            <wp:cNvGraphicFramePr>
+              <a:graphicFrameLocks xmlns:a="http://schemas.openxmlformats.org/drawingml/2006/main" noChangeAspect="1"/>
+            </wp:cNvGraphicFramePr>
+            <a:graphic xmlns:a="http://schemas.openxmlformats.org/drawingml/2006/main">
+              <a:graphicData uri="http://schemas.openxmlformats.org/drawingml/2006/picture">
+                <pic:pic xmlns:pic="http://schemas.openxmlformats.org/drawingml/2006/picture">
+                  <pic:nvPicPr>
+                    <pic:cNvPr id="683006359" name=""/>
+                    <pic:cNvPicPr/>
+                  </pic:nvPicPr>
+                  <pic:blipFill>
+                    <a:blip r:embed="rId9"/>
+                    <a:stretch>
+                      <a:fillRect/>
+                    </a:stretch>
+                  </pic:blipFill>
+                  <pic:spPr>
+                    <a:xfrm>
+                      <a:off x="0" y="0"/>
+                      <a:ext cx="5943600" cy="3183890"/>
+                    </a:xfrm>
+                    <a:prstGeom prst="rect">
+                      <a:avLst/>
+                    </a:prstGeom>
+                  </pic:spPr>
+                </pic:pic>
+              </a:graphicData>
+            </a:graphic>
+          </wp:inline>
+        </w:drawing>
+      </w:r>
+    </w:p>
+    <w:p>
+      <w:pPr>
+        <w:spacing w:after="0"/>
+        <w:jc w:val="both"/>
+        <w:rPr>
           <w:rFonts w:cstheme="minorHAnsi"/>
           <w:spacing w:val="5"/>
           <w:sz w:val="24"/>
@@ -818,6 +1127,28 @@
           <w:szCs w:val="24"/>
         </w:rPr>
       </w:pPr>
+    </w:p>
+    <w:p>
+      <w:pPr>
+        <w:spacing w:after="160" w:line="259" w:lineRule="auto"/>
+        <w:rPr>
+          <w:rFonts w:cstheme="minorHAnsi"/>
+          <w:spacing w:val="5"/>
+          <w:sz w:val="24"/>
+          <w:szCs w:val="24"/>
+          <w:shd w:val="clear" w:color="auto" w:fill="FFFFFF"/>
+        </w:rPr>
+      </w:pPr>
+      <w:r>
+        <w:rPr>
+          <w:rFonts w:cstheme="minorHAnsi"/>
+          <w:spacing w:val="5"/>
+          <w:sz w:val="24"/>
+          <w:szCs w:val="24"/>
+          <w:shd w:val="clear" w:color="auto" w:fill="FFFFFF"/>
+        </w:rPr>
+        <w:br w:type="page"/>
+      </w:r>
     </w:p>
     <w:p>
       <w:pPr>
@@ -844,6 +1175,7 @@
           <w:szCs w:val="24"/>
           <w:shd w:val="clear" w:color="auto" w:fill="FFFFFF"/>
         </w:rPr>
+        <w:lastRenderedPageBreak/>
         <w:t xml:space="preserve">screenshots of compiled successfully without error </w:t>
       </w:r>
     </w:p>
@@ -858,6 +1190,49 @@
           <w:szCs w:val="24"/>
         </w:rPr>
       </w:pPr>
+      <w:r>
+        <w:rPr>
+          <w:rFonts w:cstheme="minorHAnsi"/>
+          <w:spacing w:val="5"/>
+          <w:sz w:val="24"/>
+          <w:szCs w:val="24"/>
+        </w:rPr>
+        <w:drawing>
+          <wp:inline distT="0" distB="0" distL="0" distR="0" wp14:anchorId="69F78C98" wp14:editId="5C196D33">
+            <wp:extent cx="5943600" cy="3106420"/>
+            <wp:effectExtent l="0" t="0" r="0" b="0"/>
+            <wp:docPr id="530933195" name="Picture 1"/>
+            <wp:cNvGraphicFramePr>
+              <a:graphicFrameLocks xmlns:a="http://schemas.openxmlformats.org/drawingml/2006/main" noChangeAspect="1"/>
+            </wp:cNvGraphicFramePr>
+            <a:graphic xmlns:a="http://schemas.openxmlformats.org/drawingml/2006/main">
+              <a:graphicData uri="http://schemas.openxmlformats.org/drawingml/2006/picture">
+                <pic:pic xmlns:pic="http://schemas.openxmlformats.org/drawingml/2006/picture">
+                  <pic:nvPicPr>
+                    <pic:cNvPr id="530933195" name=""/>
+                    <pic:cNvPicPr/>
+                  </pic:nvPicPr>
+                  <pic:blipFill>
+                    <a:blip r:embed="rId10"/>
+                    <a:stretch>
+                      <a:fillRect/>
+                    </a:stretch>
+                  </pic:blipFill>
+                  <pic:spPr>
+                    <a:xfrm>
+                      <a:off x="0" y="0"/>
+                      <a:ext cx="5943600" cy="3106420"/>
+                    </a:xfrm>
+                    <a:prstGeom prst="rect">
+                      <a:avLst/>
+                    </a:prstGeom>
+                  </pic:spPr>
+                </pic:pic>
+              </a:graphicData>
+            </a:graphic>
+          </wp:inline>
+        </w:drawing>
+      </w:r>
     </w:p>
     <w:p>
       <w:pPr>
@@ -882,6 +1257,28 @@
           <w:szCs w:val="24"/>
         </w:rPr>
       </w:pPr>
+    </w:p>
+    <w:p>
+      <w:pPr>
+        <w:spacing w:after="160" w:line="259" w:lineRule="auto"/>
+        <w:rPr>
+          <w:rFonts w:cstheme="minorHAnsi"/>
+          <w:spacing w:val="5"/>
+          <w:sz w:val="24"/>
+          <w:szCs w:val="24"/>
+          <w:shd w:val="clear" w:color="auto" w:fill="FFFFFF"/>
+        </w:rPr>
+      </w:pPr>
+      <w:r>
+        <w:rPr>
+          <w:rFonts w:cstheme="minorHAnsi"/>
+          <w:spacing w:val="5"/>
+          <w:sz w:val="24"/>
+          <w:szCs w:val="24"/>
+          <w:shd w:val="clear" w:color="auto" w:fill="FFFFFF"/>
+        </w:rPr>
+        <w:br w:type="page"/>
+      </w:r>
     </w:p>
     <w:p>
       <w:pPr>
@@ -908,7 +1305,124 @@
           <w:szCs w:val="24"/>
           <w:shd w:val="clear" w:color="auto" w:fill="FFFFFF"/>
         </w:rPr>
+        <w:lastRenderedPageBreak/>
         <w:t xml:space="preserve">screenshots of full coding, including line numbers, library, all functions, main, etc. </w:t>
+      </w:r>
+    </w:p>
+    <w:p>
+      <w:pPr>
+        <w:autoSpaceDE w:val="0"/>
+        <w:autoSpaceDN w:val="0"/>
+        <w:adjustRightInd w:val="0"/>
+        <w:spacing w:after="0" w:line="240" w:lineRule="auto"/>
+        <w:jc w:val="both"/>
+        <w:rPr>
+          <w:rFonts w:ascii="Times New Roman" w:eastAsia="JansonText-Roman" w:hAnsi="Times New Roman" w:cs="Times New Roman"/>
+          <w:sz w:val="24"/>
+          <w:szCs w:val="24"/>
+          <w:lang w:eastAsia="zh-CN"/>
+        </w:rPr>
+      </w:pPr>
+      <w:r>
+        <w:rPr>
+          <w:rFonts w:ascii="Times New Roman" w:eastAsia="JansonText-Roman" w:hAnsi="Times New Roman" w:cs="Times New Roman"/>
+          <w:sz w:val="24"/>
+          <w:szCs w:val="24"/>
+          <w:lang w:eastAsia="zh-CN"/>
+        </w:rPr>
+        <w:drawing>
+          <wp:inline distT="0" distB="0" distL="0" distR="0" wp14:anchorId="3FEF2544" wp14:editId="008E2BE2">
+            <wp:extent cx="5943600" cy="2461895"/>
+            <wp:effectExtent l="0" t="0" r="0" b="0"/>
+            <wp:docPr id="1960872271" name="Picture 1"/>
+            <wp:cNvGraphicFramePr>
+              <a:graphicFrameLocks xmlns:a="http://schemas.openxmlformats.org/drawingml/2006/main" noChangeAspect="1"/>
+            </wp:cNvGraphicFramePr>
+            <a:graphic xmlns:a="http://schemas.openxmlformats.org/drawingml/2006/main">
+              <a:graphicData uri="http://schemas.openxmlformats.org/drawingml/2006/picture">
+                <pic:pic xmlns:pic="http://schemas.openxmlformats.org/drawingml/2006/picture">
+                  <pic:nvPicPr>
+                    <pic:cNvPr id="1960872271" name=""/>
+                    <pic:cNvPicPr/>
+                  </pic:nvPicPr>
+                  <pic:blipFill>
+                    <a:blip r:embed="rId11"/>
+                    <a:stretch>
+                      <a:fillRect/>
+                    </a:stretch>
+                  </pic:blipFill>
+                  <pic:spPr>
+                    <a:xfrm>
+                      <a:off x="0" y="0"/>
+                      <a:ext cx="5943600" cy="2461895"/>
+                    </a:xfrm>
+                    <a:prstGeom prst="rect">
+                      <a:avLst/>
+                    </a:prstGeom>
+                  </pic:spPr>
+                </pic:pic>
+              </a:graphicData>
+            </a:graphic>
+          </wp:inline>
+        </w:drawing>
+      </w:r>
+    </w:p>
+    <w:p>
+      <w:pPr>
+        <w:autoSpaceDE w:val="0"/>
+        <w:autoSpaceDN w:val="0"/>
+        <w:adjustRightInd w:val="0"/>
+        <w:spacing w:after="0" w:line="240" w:lineRule="auto"/>
+        <w:jc w:val="both"/>
+        <w:rPr>
+          <w:rFonts w:ascii="Times New Roman" w:eastAsia="JansonText-Roman" w:hAnsi="Times New Roman" w:cs="Times New Roman"/>
+          <w:sz w:val="24"/>
+          <w:szCs w:val="24"/>
+          <w:lang w:eastAsia="zh-CN"/>
+        </w:rPr>
+      </w:pPr>
+      <w:r>
+        <w:rPr>
+          <w:rFonts w:ascii="Times New Roman" w:eastAsia="JansonText-Roman" w:hAnsi="Times New Roman" w:cs="Times New Roman"/>
+          <w:sz w:val="24"/>
+          <w:szCs w:val="24"/>
+          <w:lang w:eastAsia="zh-CN"/>
+        </w:rPr>
+        <w:drawing>
+          <wp:inline distT="0" distB="0" distL="0" distR="0" wp14:anchorId="3CF8C62A" wp14:editId="7D534221">
+            <wp:extent cx="5943600" cy="2068195"/>
+            <wp:effectExtent l="0" t="0" r="0" b="8255"/>
+            <wp:docPr id="349462934" name="Picture 1"/>
+            <wp:cNvGraphicFramePr>
+              <a:graphicFrameLocks xmlns:a="http://schemas.openxmlformats.org/drawingml/2006/main" noChangeAspect="1"/>
+            </wp:cNvGraphicFramePr>
+            <a:graphic xmlns:a="http://schemas.openxmlformats.org/drawingml/2006/main">
+              <a:graphicData uri="http://schemas.openxmlformats.org/drawingml/2006/picture">
+                <pic:pic xmlns:pic="http://schemas.openxmlformats.org/drawingml/2006/picture">
+                  <pic:nvPicPr>
+                    <pic:cNvPr id="349462934" name=""/>
+                    <pic:cNvPicPr/>
+                  </pic:nvPicPr>
+                  <pic:blipFill>
+                    <a:blip r:embed="rId12"/>
+                    <a:stretch>
+                      <a:fillRect/>
+                    </a:stretch>
+                  </pic:blipFill>
+                  <pic:spPr>
+                    <a:xfrm>
+                      <a:off x="0" y="0"/>
+                      <a:ext cx="5943600" cy="2068195"/>
+                    </a:xfrm>
+                    <a:prstGeom prst="rect">
+                      <a:avLst/>
+                    </a:prstGeom>
+                  </pic:spPr>
+                </pic:pic>
+              </a:graphicData>
+            </a:graphic>
+          </wp:inline>
+        </w:drawing>
       </w:r>
     </w:p>
     <w:p>
@@ -971,8 +1485,170 @@
         </w:rPr>
       </w:pPr>
     </w:p>
+    <w:p>
+      <w:pPr>
+        <w:autoSpaceDE w:val="0"/>
+        <w:autoSpaceDN w:val="0"/>
+        <w:adjustRightInd w:val="0"/>
+        <w:spacing w:after="120" w:line="240" w:lineRule="auto"/>
+        <w:jc w:val="both"/>
+        <w:rPr>
+          <w:rFonts w:ascii="Times New Roman" w:eastAsia="JansonText-Roman" w:hAnsi="Times New Roman" w:cs="Times New Roman"/>
+          <w:sz w:val="24"/>
+          <w:szCs w:val="24"/>
+          <w:lang w:eastAsia="zh-CN"/>
+        </w:rPr>
+      </w:pPr>
+    </w:p>
+    <w:p>
+      <w:pPr>
+        <w:autoSpaceDE w:val="0"/>
+        <w:autoSpaceDN w:val="0"/>
+        <w:adjustRightInd w:val="0"/>
+        <w:spacing w:after="0" w:line="240" w:lineRule="auto"/>
+        <w:jc w:val="both"/>
+        <w:rPr>
+          <w:rFonts w:ascii="Times New Roman" w:eastAsia="JansonText-Roman" w:hAnsi="Times New Roman" w:cs="Times New Roman"/>
+          <w:sz w:val="24"/>
+          <w:szCs w:val="24"/>
+          <w:lang w:eastAsia="zh-CN"/>
+        </w:rPr>
+      </w:pPr>
+      <w:r>
+        <w:rPr>
+          <w:rFonts w:ascii="Times New Roman" w:eastAsia="JansonText-Roman" w:hAnsi="Times New Roman" w:cs="Times New Roman"/>
+          <w:sz w:val="24"/>
+          <w:szCs w:val="24"/>
+          <w:lang w:eastAsia="zh-CN"/>
+        </w:rPr>
+        <w:lastRenderedPageBreak/>
+        <w:drawing>
+          <wp:inline distT="0" distB="0" distL="0" distR="0" wp14:anchorId="3DDC5F59" wp14:editId="108052DD">
+            <wp:extent cx="5943600" cy="2425065"/>
+            <wp:effectExtent l="0" t="0" r="0" b="0"/>
+            <wp:docPr id="2103890948" name="Picture 1"/>
+            <wp:cNvGraphicFramePr>
+              <a:graphicFrameLocks xmlns:a="http://schemas.openxmlformats.org/drawingml/2006/main" noChangeAspect="1"/>
+            </wp:cNvGraphicFramePr>
+            <a:graphic xmlns:a="http://schemas.openxmlformats.org/drawingml/2006/main">
+              <a:graphicData uri="http://schemas.openxmlformats.org/drawingml/2006/picture">
+                <pic:pic xmlns:pic="http://schemas.openxmlformats.org/drawingml/2006/picture">
+                  <pic:nvPicPr>
+                    <pic:cNvPr id="2103890948" name=""/>
+                    <pic:cNvPicPr/>
+                  </pic:nvPicPr>
+                  <pic:blipFill>
+                    <a:blip r:embed="rId13"/>
+                    <a:stretch>
+                      <a:fillRect/>
+                    </a:stretch>
+                  </pic:blipFill>
+                  <pic:spPr>
+                    <a:xfrm>
+                      <a:off x="0" y="0"/>
+                      <a:ext cx="5943600" cy="2425065"/>
+                    </a:xfrm>
+                    <a:prstGeom prst="rect">
+                      <a:avLst/>
+                    </a:prstGeom>
+                  </pic:spPr>
+                </pic:pic>
+              </a:graphicData>
+            </a:graphic>
+          </wp:inline>
+        </w:drawing>
+      </w:r>
+    </w:p>
+    <w:p>
+      <w:pPr>
+        <w:autoSpaceDE w:val="0"/>
+        <w:autoSpaceDN w:val="0"/>
+        <w:adjustRightInd w:val="0"/>
+        <w:spacing w:after="0" w:line="240" w:lineRule="auto"/>
+        <w:jc w:val="both"/>
+        <w:rPr>
+          <w:rFonts w:ascii="Times New Roman" w:eastAsia="JansonText-Roman" w:hAnsi="Times New Roman" w:cs="Times New Roman"/>
+          <w:sz w:val="24"/>
+          <w:szCs w:val="24"/>
+          <w:lang w:eastAsia="zh-CN"/>
+        </w:rPr>
+      </w:pPr>
+      <w:r>
+        <w:rPr>
+          <w:rFonts w:ascii="Times New Roman" w:eastAsia="JansonText-Roman" w:hAnsi="Times New Roman" w:cs="Times New Roman"/>
+          <w:sz w:val="24"/>
+          <w:szCs w:val="24"/>
+          <w:lang w:eastAsia="zh-CN"/>
+        </w:rPr>
+        <w:drawing>
+          <wp:inline distT="0" distB="0" distL="0" distR="0" wp14:anchorId="687AD5B6" wp14:editId="006694B8">
+            <wp:extent cx="5943600" cy="1350010"/>
+            <wp:effectExtent l="0" t="0" r="0" b="2540"/>
+            <wp:docPr id="190450938" name="Picture 1"/>
+            <wp:cNvGraphicFramePr>
+              <a:graphicFrameLocks xmlns:a="http://schemas.openxmlformats.org/drawingml/2006/main" noChangeAspect="1"/>
+            </wp:cNvGraphicFramePr>
+            <a:graphic xmlns:a="http://schemas.openxmlformats.org/drawingml/2006/main">
+              <a:graphicData uri="http://schemas.openxmlformats.org/drawingml/2006/picture">
+                <pic:pic xmlns:pic="http://schemas.openxmlformats.org/drawingml/2006/picture">
+                  <pic:nvPicPr>
+                    <pic:cNvPr id="190450938" name=""/>
+                    <pic:cNvPicPr/>
+                  </pic:nvPicPr>
+                  <pic:blipFill>
+                    <a:blip r:embed="rId14"/>
+                    <a:stretch>
+                      <a:fillRect/>
+                    </a:stretch>
+                  </pic:blipFill>
+                  <pic:spPr>
+                    <a:xfrm>
+                      <a:off x="0" y="0"/>
+                      <a:ext cx="5943600" cy="1350010"/>
+                    </a:xfrm>
+                    <a:prstGeom prst="rect">
+                      <a:avLst/>
+                    </a:prstGeom>
+                  </pic:spPr>
+                </pic:pic>
+              </a:graphicData>
+            </a:graphic>
+          </wp:inline>
+        </w:drawing>
+      </w:r>
+    </w:p>
+    <w:p>
+      <w:pPr>
+        <w:autoSpaceDE w:val="0"/>
+        <w:autoSpaceDN w:val="0"/>
+        <w:adjustRightInd w:val="0"/>
+        <w:spacing w:after="120" w:line="240" w:lineRule="auto"/>
+        <w:jc w:val="both"/>
+        <w:rPr>
+          <w:rFonts w:ascii="Times New Roman" w:eastAsia="JansonText-Roman" w:hAnsi="Times New Roman" w:cs="Times New Roman"/>
+          <w:sz w:val="24"/>
+          <w:szCs w:val="24"/>
+          <w:lang w:eastAsia="zh-CN"/>
+        </w:rPr>
+      </w:pPr>
+    </w:p>
+    <w:p>
+      <w:pPr>
+        <w:autoSpaceDE w:val="0"/>
+        <w:autoSpaceDN w:val="0"/>
+        <w:adjustRightInd w:val="0"/>
+        <w:spacing w:after="120" w:line="240" w:lineRule="auto"/>
+        <w:jc w:val="both"/>
+        <w:rPr>
+          <w:rFonts w:ascii="Times New Roman" w:eastAsia="JansonText-Roman" w:hAnsi="Times New Roman" w:cs="Times New Roman"/>
+          <w:sz w:val="24"/>
+          <w:szCs w:val="24"/>
+          <w:lang w:eastAsia="zh-CN"/>
+        </w:rPr>
+      </w:pPr>
+    </w:p>
     <w:sectPr>
-      <w:footerReference w:type="default" r:id="rId8"/>
+      <w:footerReference w:type="default" r:id="rId15"/>
       <w:pgSz w:w="12240" w:h="15840"/>
       <w:pgMar w:top="1440" w:right="1440" w:bottom="1440" w:left="1440" w:header="720" w:footer="720" w:gutter="0"/>
       <w:cols w:space="720"/>
@@ -1556,6 +2232,155 @@
     </w:lvl>
   </w:abstractNum>
   <w:abstractNum w:abstractNumId="4" w15:restartNumberingAfterBreak="0">
+    <w:nsid w:val="34222F7B"/>
+    <w:multiLevelType w:val="multilevel"/>
+    <w:tmpl w:val="6AAA991E"/>
+    <w:lvl w:ilvl="0">
+      <w:start w:val="1"/>
+      <w:numFmt w:val="bullet"/>
+      <w:lvlText w:val=""/>
+      <w:lvlJc w:val="left"/>
+      <w:pPr>
+        <w:tabs>
+          <w:tab w:val="num" w:pos="720"/>
+        </w:tabs>
+        <w:ind w:left="720" w:hanging="360"/>
+      </w:pPr>
+      <w:rPr>
+        <w:rFonts w:ascii="Symbol" w:hAnsi="Symbol" w:hint="default"/>
+        <w:sz w:val="20"/>
+      </w:rPr>
+    </w:lvl>
+    <w:lvl w:ilvl="1">
+      <w:start w:val="1"/>
+      <w:numFmt w:val="bullet"/>
+      <w:lvlText w:val="o"/>
+      <w:lvlJc w:val="left"/>
+      <w:pPr>
+        <w:tabs>
+          <w:tab w:val="num" w:pos="1440"/>
+        </w:tabs>
+        <w:ind w:left="1440" w:hanging="360"/>
+      </w:pPr>
+      <w:rPr>
+        <w:rFonts w:ascii="Courier New" w:hAnsi="Courier New" w:hint="default"/>
+        <w:sz w:val="20"/>
+      </w:rPr>
+    </w:lvl>
+    <w:lvl w:ilvl="2" w:tentative="1">
+      <w:start w:val="1"/>
+      <w:numFmt w:val="bullet"/>
+      <w:lvlText w:val=""/>
+      <w:lvlJc w:val="left"/>
+      <w:pPr>
+        <w:tabs>
+          <w:tab w:val="num" w:pos="2160"/>
+        </w:tabs>
+        <w:ind w:left="2160" w:hanging="360"/>
+      </w:pPr>
+      <w:rPr>
+        <w:rFonts w:ascii="Symbol" w:hAnsi="Symbol" w:hint="default"/>
+        <w:sz w:val="20"/>
+      </w:rPr>
+    </w:lvl>
+    <w:lvl w:ilvl="3" w:tentative="1">
+      <w:start w:val="1"/>
+      <w:numFmt w:val="bullet"/>
+      <w:lvlText w:val=""/>
+      <w:lvlJc w:val="left"/>
+      <w:pPr>
+        <w:tabs>
+          <w:tab w:val="num" w:pos="2880"/>
+        </w:tabs>
+        <w:ind w:left="2880" w:hanging="360"/>
+      </w:pPr>
+      <w:rPr>
+        <w:rFonts w:ascii="Symbol" w:hAnsi="Symbol" w:hint="default"/>
+        <w:sz w:val="20"/>
+      </w:rPr>
+    </w:lvl>
+    <w:lvl w:ilvl="4" w:tentative="1">
+      <w:start w:val="1"/>
+      <w:numFmt w:val="bullet"/>
+      <w:lvlText w:val=""/>
+      <w:lvlJc w:val="left"/>
+      <w:pPr>
+        <w:tabs>
+          <w:tab w:val="num" w:pos="3600"/>
+        </w:tabs>
+        <w:ind w:left="3600" w:hanging="360"/>
+      </w:pPr>
+      <w:rPr>
+        <w:rFonts w:ascii="Symbol" w:hAnsi="Symbol" w:hint="default"/>
+        <w:sz w:val="20"/>
+      </w:rPr>
+    </w:lvl>
+    <w:lvl w:ilvl="5" w:tentative="1">
+      <w:start w:val="1"/>
+      <w:numFmt w:val="bullet"/>
+      <w:lvlText w:val=""/>
+      <w:lvlJc w:val="left"/>
+      <w:pPr>
+        <w:tabs>
+          <w:tab w:val="num" w:pos="4320"/>
+        </w:tabs>
+        <w:ind w:left="4320" w:hanging="360"/>
+      </w:pPr>
+      <w:rPr>
+        <w:rFonts w:ascii="Symbol" w:hAnsi="Symbol" w:hint="default"/>
+        <w:sz w:val="20"/>
+      </w:rPr>
+    </w:lvl>
+    <w:lvl w:ilvl="6" w:tentative="1">
+      <w:start w:val="1"/>
+      <w:numFmt w:val="bullet"/>
+      <w:lvlText w:val=""/>
+      <w:lvlJc w:val="left"/>
+      <w:pPr>
+        <w:tabs>
+          <w:tab w:val="num" w:pos="5040"/>
+        </w:tabs>
+        <w:ind w:left="5040" w:hanging="360"/>
+      </w:pPr>
+      <w:rPr>
+        <w:rFonts w:ascii="Symbol" w:hAnsi="Symbol" w:hint="default"/>
+        <w:sz w:val="20"/>
+      </w:rPr>
+    </w:lvl>
+    <w:lvl w:ilvl="7" w:tentative="1">
+      <w:start w:val="1"/>
+      <w:numFmt w:val="bullet"/>
+      <w:lvlText w:val=""/>
+      <w:lvlJc w:val="left"/>
+      <w:pPr>
+        <w:tabs>
+          <w:tab w:val="num" w:pos="5760"/>
+        </w:tabs>
+        <w:ind w:left="5760" w:hanging="360"/>
+      </w:pPr>
+      <w:rPr>
+        <w:rFonts w:ascii="Symbol" w:hAnsi="Symbol" w:hint="default"/>
+        <w:sz w:val="20"/>
+      </w:rPr>
+    </w:lvl>
+    <w:lvl w:ilvl="8" w:tentative="1">
+      <w:start w:val="1"/>
+      <w:numFmt w:val="bullet"/>
+      <w:lvlText w:val=""/>
+      <w:lvlJc w:val="left"/>
+      <w:pPr>
+        <w:tabs>
+          <w:tab w:val="num" w:pos="6480"/>
+        </w:tabs>
+        <w:ind w:left="6480" w:hanging="360"/>
+      </w:pPr>
+      <w:rPr>
+        <w:rFonts w:ascii="Symbol" w:hAnsi="Symbol" w:hint="default"/>
+        <w:sz w:val="20"/>
+      </w:rPr>
+    </w:lvl>
+  </w:abstractNum>
+  <w:abstractNum w:abstractNumId="5" w15:restartNumberingAfterBreak="0">
     <w:nsid w:val="3F7C27E0"/>
     <w:multiLevelType w:val="hybridMultilevel"/>
     <w:tmpl w:val="14D6D086"/>
@@ -1644,7 +2469,7 @@
       </w:pPr>
     </w:lvl>
   </w:abstractNum>
-  <w:abstractNum w:abstractNumId="5" w15:restartNumberingAfterBreak="0">
+  <w:abstractNum w:abstractNumId="6" w15:restartNumberingAfterBreak="0">
     <w:nsid w:val="464C17FD"/>
     <w:multiLevelType w:val="hybridMultilevel"/>
     <w:tmpl w:val="D86AE2D8"/>
@@ -1733,7 +2558,7 @@
       </w:pPr>
     </w:lvl>
   </w:abstractNum>
-  <w:abstractNum w:abstractNumId="6" w15:restartNumberingAfterBreak="0">
+  <w:abstractNum w:abstractNumId="7" w15:restartNumberingAfterBreak="0">
     <w:nsid w:val="4AB95639"/>
     <w:multiLevelType w:val="hybridMultilevel"/>
     <w:tmpl w:val="787ED57C"/>
@@ -1822,7 +2647,7 @@
       </w:pPr>
     </w:lvl>
   </w:abstractNum>
-  <w:abstractNum w:abstractNumId="7" w15:restartNumberingAfterBreak="0">
+  <w:abstractNum w:abstractNumId="8" w15:restartNumberingAfterBreak="0">
     <w:nsid w:val="4BC9232B"/>
     <w:multiLevelType w:val="hybridMultilevel"/>
     <w:tmpl w:val="5B90407C"/>
@@ -1911,7 +2736,7 @@
       </w:pPr>
     </w:lvl>
   </w:abstractNum>
-  <w:abstractNum w:abstractNumId="8" w15:restartNumberingAfterBreak="0">
+  <w:abstractNum w:abstractNumId="9" w15:restartNumberingAfterBreak="0">
     <w:nsid w:val="564A1F76"/>
     <w:multiLevelType w:val="hybridMultilevel"/>
     <w:tmpl w:val="510A55C0"/>
@@ -2000,7 +2825,156 @@
       </w:pPr>
     </w:lvl>
   </w:abstractNum>
-  <w:abstractNum w:abstractNumId="9" w15:restartNumberingAfterBreak="0">
+  <w:abstractNum w:abstractNumId="10" w15:restartNumberingAfterBreak="0">
+    <w:nsid w:val="5D5C49C9"/>
+    <w:multiLevelType w:val="multilevel"/>
+    <w:tmpl w:val="E5545F9E"/>
+    <w:lvl w:ilvl="0">
+      <w:start w:val="1"/>
+      <w:numFmt w:val="bullet"/>
+      <w:lvlText w:val=""/>
+      <w:lvlJc w:val="left"/>
+      <w:pPr>
+        <w:tabs>
+          <w:tab w:val="num" w:pos="720"/>
+        </w:tabs>
+        <w:ind w:left="720" w:hanging="360"/>
+      </w:pPr>
+      <w:rPr>
+        <w:rFonts w:ascii="Symbol" w:hAnsi="Symbol" w:hint="default"/>
+        <w:sz w:val="20"/>
+      </w:rPr>
+    </w:lvl>
+    <w:lvl w:ilvl="1" w:tentative="1">
+      <w:start w:val="1"/>
+      <w:numFmt w:val="bullet"/>
+      <w:lvlText w:val=""/>
+      <w:lvlJc w:val="left"/>
+      <w:pPr>
+        <w:tabs>
+          <w:tab w:val="num" w:pos="1440"/>
+        </w:tabs>
+        <w:ind w:left="1440" w:hanging="360"/>
+      </w:pPr>
+      <w:rPr>
+        <w:rFonts w:ascii="Symbol" w:hAnsi="Symbol" w:hint="default"/>
+        <w:sz w:val="20"/>
+      </w:rPr>
+    </w:lvl>
+    <w:lvl w:ilvl="2" w:tentative="1">
+      <w:start w:val="1"/>
+      <w:numFmt w:val="bullet"/>
+      <w:lvlText w:val=""/>
+      <w:lvlJc w:val="left"/>
+      <w:pPr>
+        <w:tabs>
+          <w:tab w:val="num" w:pos="2160"/>
+        </w:tabs>
+        <w:ind w:left="2160" w:hanging="360"/>
+      </w:pPr>
+      <w:rPr>
+        <w:rFonts w:ascii="Symbol" w:hAnsi="Symbol" w:hint="default"/>
+        <w:sz w:val="20"/>
+      </w:rPr>
+    </w:lvl>
+    <w:lvl w:ilvl="3" w:tentative="1">
+      <w:start w:val="1"/>
+      <w:numFmt w:val="bullet"/>
+      <w:lvlText w:val=""/>
+      <w:lvlJc w:val="left"/>
+      <w:pPr>
+        <w:tabs>
+          <w:tab w:val="num" w:pos="2880"/>
+        </w:tabs>
+        <w:ind w:left="2880" w:hanging="360"/>
+      </w:pPr>
+      <w:rPr>
+        <w:rFonts w:ascii="Symbol" w:hAnsi="Symbol" w:hint="default"/>
+        <w:sz w:val="20"/>
+      </w:rPr>
+    </w:lvl>
+    <w:lvl w:ilvl="4" w:tentative="1">
+      <w:start w:val="1"/>
+      <w:numFmt w:val="bullet"/>
+      <w:lvlText w:val=""/>
+      <w:lvlJc w:val="left"/>
+      <w:pPr>
+        <w:tabs>
+          <w:tab w:val="num" w:pos="3600"/>
+        </w:tabs>
+        <w:ind w:left="3600" w:hanging="360"/>
+      </w:pPr>
+      <w:rPr>
+        <w:rFonts w:ascii="Symbol" w:hAnsi="Symbol" w:hint="default"/>
+        <w:sz w:val="20"/>
+      </w:rPr>
+    </w:lvl>
+    <w:lvl w:ilvl="5" w:tentative="1">
+      <w:start w:val="1"/>
+      <w:numFmt w:val="bullet"/>
+      <w:lvlText w:val=""/>
+      <w:lvlJc w:val="left"/>
+      <w:pPr>
+        <w:tabs>
+          <w:tab w:val="num" w:pos="4320"/>
+        </w:tabs>
+        <w:ind w:left="4320" w:hanging="360"/>
+      </w:pPr>
+      <w:rPr>
+        <w:rFonts w:ascii="Symbol" w:hAnsi="Symbol" w:hint="default"/>
+        <w:sz w:val="20"/>
+      </w:rPr>
+    </w:lvl>
+    <w:lvl w:ilvl="6" w:tentative="1">
+      <w:start w:val="1"/>
+      <w:numFmt w:val="bullet"/>
+      <w:lvlText w:val=""/>
+      <w:lvlJc w:val="left"/>
+      <w:pPr>
+        <w:tabs>
+          <w:tab w:val="num" w:pos="5040"/>
+        </w:tabs>
+        <w:ind w:left="5040" w:hanging="360"/>
+      </w:pPr>
+      <w:rPr>
+        <w:rFonts w:ascii="Symbol" w:hAnsi="Symbol" w:hint="default"/>
+        <w:sz w:val="20"/>
+      </w:rPr>
+    </w:lvl>
+    <w:lvl w:ilvl="7" w:tentative="1">
+      <w:start w:val="1"/>
+      <w:numFmt w:val="bullet"/>
+      <w:lvlText w:val=""/>
+      <w:lvlJc w:val="left"/>
+      <w:pPr>
+        <w:tabs>
+          <w:tab w:val="num" w:pos="5760"/>
+        </w:tabs>
+        <w:ind w:left="5760" w:hanging="360"/>
+      </w:pPr>
+      <w:rPr>
+        <w:rFonts w:ascii="Symbol" w:hAnsi="Symbol" w:hint="default"/>
+        <w:sz w:val="20"/>
+      </w:rPr>
+    </w:lvl>
+    <w:lvl w:ilvl="8" w:tentative="1">
+      <w:start w:val="1"/>
+      <w:numFmt w:val="bullet"/>
+      <w:lvlText w:val=""/>
+      <w:lvlJc w:val="left"/>
+      <w:pPr>
+        <w:tabs>
+          <w:tab w:val="num" w:pos="6480"/>
+        </w:tabs>
+        <w:ind w:left="6480" w:hanging="360"/>
+      </w:pPr>
+      <w:rPr>
+        <w:rFonts w:ascii="Symbol" w:hAnsi="Symbol" w:hint="default"/>
+        <w:sz w:val="20"/>
+      </w:rPr>
+    </w:lvl>
+  </w:abstractNum>
+  <w:abstractNum w:abstractNumId="11" w15:restartNumberingAfterBreak="0">
     <w:nsid w:val="6621576E"/>
     <w:multiLevelType w:val="hybridMultilevel"/>
     <w:tmpl w:val="6D8608E4"/>
@@ -2113,7 +3087,7 @@
       </w:rPr>
     </w:lvl>
   </w:abstractNum>
-  <w:abstractNum w:abstractNumId="10" w15:restartNumberingAfterBreak="0">
+  <w:abstractNum w:abstractNumId="12" w15:restartNumberingAfterBreak="0">
     <w:nsid w:val="6AC71756"/>
     <w:multiLevelType w:val="hybridMultilevel"/>
     <w:tmpl w:val="E9945A1E"/>
@@ -2202,7 +3176,7 @@
       </w:pPr>
     </w:lvl>
   </w:abstractNum>
-  <w:abstractNum w:abstractNumId="11" w15:restartNumberingAfterBreak="0">
+  <w:abstractNum w:abstractNumId="13" w15:restartNumberingAfterBreak="0">
     <w:nsid w:val="721B40D1"/>
     <w:multiLevelType w:val="hybridMultilevel"/>
     <w:tmpl w:val="787ED57C"/>
@@ -2291,7 +3265,7 @@
       </w:pPr>
     </w:lvl>
   </w:abstractNum>
-  <w:abstractNum w:abstractNumId="12" w15:restartNumberingAfterBreak="0">
+  <w:abstractNum w:abstractNumId="14" w15:restartNumberingAfterBreak="0">
     <w:nsid w:val="73E45253"/>
     <w:multiLevelType w:val="hybridMultilevel"/>
     <w:tmpl w:val="933A8D78"/>
@@ -2377,7 +3351,7 @@
       </w:pPr>
     </w:lvl>
   </w:abstractNum>
-  <w:abstractNum w:abstractNumId="13" w15:restartNumberingAfterBreak="0">
+  <w:abstractNum w:abstractNumId="15" w15:restartNumberingAfterBreak="0">
     <w:nsid w:val="76A431D0"/>
     <w:multiLevelType w:val="hybridMultilevel"/>
     <w:tmpl w:val="B6A6ADDA"/>
@@ -2467,7 +3441,7 @@
       </w:pPr>
     </w:lvl>
   </w:abstractNum>
-  <w:abstractNum w:abstractNumId="14" w15:restartNumberingAfterBreak="0">
+  <w:abstractNum w:abstractNumId="16" w15:restartNumberingAfterBreak="0">
     <w:nsid w:val="78536A03"/>
     <w:multiLevelType w:val="hybridMultilevel"/>
     <w:tmpl w:val="6FF47616"/>
@@ -2581,49 +3555,55 @@
     </w:lvl>
   </w:abstractNum>
   <w:num w:numId="1" w16cid:durableId="1642928640">
-    <w:abstractNumId w:val="4"/>
+    <w:abstractNumId w:val="5"/>
   </w:num>
   <w:num w:numId="2" w16cid:durableId="810319614">
     <w:abstractNumId w:val="0"/>
   </w:num>
   <w:num w:numId="3" w16cid:durableId="2130009671">
-    <w:abstractNumId w:val="7"/>
+    <w:abstractNumId w:val="8"/>
   </w:num>
   <w:num w:numId="4" w16cid:durableId="218132100">
-    <w:abstractNumId w:val="5"/>
+    <w:abstractNumId w:val="6"/>
   </w:num>
   <w:num w:numId="5" w16cid:durableId="1648700052">
     <w:abstractNumId w:val="1"/>
   </w:num>
   <w:num w:numId="6" w16cid:durableId="406194445">
-    <w:abstractNumId w:val="13"/>
+    <w:abstractNumId w:val="15"/>
   </w:num>
   <w:num w:numId="7" w16cid:durableId="1564560307">
     <w:abstractNumId w:val="2"/>
   </w:num>
   <w:num w:numId="8" w16cid:durableId="1017384180">
+    <w:abstractNumId w:val="11"/>
+  </w:num>
+  <w:num w:numId="9" w16cid:durableId="107092044">
+    <w:abstractNumId w:val="16"/>
+  </w:num>
+  <w:num w:numId="10" w16cid:durableId="997613787">
+    <w:abstractNumId w:val="14"/>
+  </w:num>
+  <w:num w:numId="11" w16cid:durableId="1065907120">
+    <w:abstractNumId w:val="12"/>
+  </w:num>
+  <w:num w:numId="12" w16cid:durableId="869539045">
     <w:abstractNumId w:val="9"/>
   </w:num>
-  <w:num w:numId="9" w16cid:durableId="107092044">
-    <w:abstractNumId w:val="14"/>
-  </w:num>
-  <w:num w:numId="10" w16cid:durableId="997613787">
-    <w:abstractNumId w:val="12"/>
-  </w:num>
-  <w:num w:numId="11" w16cid:durableId="1065907120">
-    <w:abstractNumId w:val="10"/>
-  </w:num>
-  <w:num w:numId="12" w16cid:durableId="869539045">
-    <w:abstractNumId w:val="8"/>
-  </w:num>
   <w:num w:numId="13" w16cid:durableId="1541281961">
-    <w:abstractNumId w:val="11"/>
+    <w:abstractNumId w:val="13"/>
   </w:num>
   <w:num w:numId="14" w16cid:durableId="1992515769">
     <w:abstractNumId w:val="3"/>
   </w:num>
   <w:num w:numId="15" w16cid:durableId="49115578">
-    <w:abstractNumId w:val="6"/>
+    <w:abstractNumId w:val="7"/>
+  </w:num>
+  <w:num w:numId="16" w16cid:durableId="1559365737">
+    <w:abstractNumId w:val="10"/>
+  </w:num>
+  <w:num w:numId="17" w16cid:durableId="1069645674">
+    <w:abstractNumId w:val="4"/>
   </w:num>
 </w:numbering>
 </file>
@@ -3038,7 +4018,6 @@
   <w:style w:type="character" w:default="1" w:styleId="DefaultParagraphFont">
     <w:name w:val="Default Paragraph Font"/>
     <w:uiPriority w:val="1"/>
-    <w:semiHidden/>
     <w:unhideWhenUsed/>
   </w:style>
   <w:style w:type="table" w:default="1" w:styleId="TableNormal">

</xml_diff>